<commit_message>
docs(schema): hoan thanh sql ddl skeleton cho luong L2
</commit_message>
<xml_diff>
--- a/docs/BT1_L2_Vu_Hoang_Thanh_Vy_2374802010580.docx
+++ b/docs/BT1_L2_Vu_Hoang_Thanh_Vy_2374802010580.docx
@@ -923,7 +923,15 @@
       </w:r>
       <w:proofErr w:type="spellEnd"/>
       <w:r>
-        <w:t xml:space="preserve"> — Tiếp nhận yêu cầu bảo hành: tra cứu, xác minh bảo hành và ghi nhận phiếu</w:t>
+        <w:t xml:space="preserve"> — </w:t>
+      </w:r>
+      <w:proofErr w:type="spellStart"/>
+      <w:r>
+        <w:t>Tiếp</w:t>
+      </w:r>
+      <w:proofErr w:type="spellEnd"/>
+      <w:r>
+        <w:t xml:space="preserve"> nhận yêu cầu bảo hành: tra cứu, xác minh bảo hành và ghi nhận phiếu</w:t>
       </w:r>
     </w:p>
     <w:tbl>
@@ -6618,7 +6626,7 @@
           <w:noProof/>
         </w:rPr>
         <w:drawing>
-          <wp:inline distT="0" distB="0" distL="0" distR="0" wp14:anchorId="09893CAB" wp14:editId="70E91CAC">
+          <wp:inline distT="0" distB="0" distL="0" distR="0" wp14:anchorId="5B74CF28" wp14:editId="2B3C2586">
             <wp:extent cx="6120130" cy="5258435"/>
             <wp:effectExtent l="0" t="0" r="0" b="0"/>
             <wp:docPr id="1" name="Picture 1"/>
@@ -7047,8 +7055,6 @@
         <w:pStyle w:val="Heading3"/>
       </w:pPr>
       <w:bookmarkStart w:id="14" w:name="c.1.-danh-sách-endpoint"/>
-      <w:bookmarkStart w:id="15" w:name="_GoBack"/>
-      <w:bookmarkEnd w:id="15"/>
       <w:r>
         <w:t>C.1. Danh sách endpoint</w:t>
       </w:r>
@@ -8157,7 +8163,7 @@
       </w:r>
     </w:p>
     <w:p>
-      <w:bookmarkStart w:id="16" w:name="X572125f4fb03c975397b7509023c02043604ae0"/>
+      <w:bookmarkStart w:id="15" w:name="X572125f4fb03c975397b7509023c02043604ae0"/>
       <w:bookmarkEnd w:id="14"/>
       <w:r>
         <w:pict>
@@ -8169,8 +8175,8 @@
       <w:pPr>
         <w:pStyle w:val="Heading3"/>
       </w:pPr>
-      <w:bookmarkStart w:id="17" w:name="c.5.-quy-tắc-validation-từng-trường"/>
-      <w:bookmarkEnd w:id="16"/>
+      <w:bookmarkStart w:id="16" w:name="c.5.-quy-tắc-validation-từng-trường"/>
+      <w:bookmarkEnd w:id="15"/>
       <w:r>
         <w:t>C.2</w:t>
       </w:r>
@@ -8973,8 +8979,8 @@
       <w:pPr>
         <w:pStyle w:val="Heading3"/>
       </w:pPr>
-      <w:bookmarkStart w:id="18" w:name="c.6.-tự-kiểm-truy-vết"/>
-      <w:bookmarkEnd w:id="17"/>
+      <w:bookmarkStart w:id="17" w:name="c.6.-tự-kiểm-truy-vết"/>
+      <w:bookmarkEnd w:id="16"/>
       <w:r>
         <w:t>C.3</w:t>
       </w:r>
@@ -9284,9 +9290,9 @@
       <w:pPr>
         <w:pStyle w:val="Heading2"/>
       </w:pPr>
-      <w:bookmarkStart w:id="19" w:name="X3f68dec7c2e030eb24c79d64acab704f44a4fe4"/>
+      <w:bookmarkStart w:id="18" w:name="X3f68dec7c2e030eb24c79d64acab704f44a4fe4"/>
       <w:bookmarkEnd w:id="13"/>
-      <w:bookmarkEnd w:id="18"/>
+      <w:bookmarkEnd w:id="17"/>
       <w:r>
         <w:t>Phụ lục D. Bảng khai báo sử dụng công cụ AI hỗ trợ — BT1</w:t>
       </w:r>
@@ -9653,9 +9659,11 @@
         <w:pStyle w:val="BodyText"/>
       </w:pPr>
       <w:r>
-        <w:t>Họ tên: Vũ Hoàng Thanh Vy — MSSV: 2374802010580 — Ngày: [điền ngày nộp]</w:t>
-      </w:r>
+        <w:t xml:space="preserve">Họ tên: Vũ Hoàng Thanh Vy — MSSV: 2374802010580 </w:t>
+      </w:r>
+      <w:bookmarkStart w:id="19" w:name="_GoBack"/>
       <w:bookmarkEnd w:id="0"/>
+      <w:bookmarkEnd w:id="18"/>
       <w:bookmarkEnd w:id="19"/>
     </w:p>
     <w:sectPr>
@@ -9740,7 +9748,7 @@
         <w:noProof/>
         <w:sz w:val="18"/>
       </w:rPr>
-      <w:t>1</w:t>
+      <w:t>8</w:t>
     </w:r>
     <w:r>
       <w:rPr>

</xml_diff>